<commit_message>
Update garment analyzer, Lyria client, AI router and docs
Remove NOCTURNE_presentation.pdf; sync AGENTS/CLAUDE/README/TASKS/SPEC and session log.

Co-Authored-By: Claude Opus 5.5 <noreply@anthropic.com>
</commit_message>
<xml_diff>
--- a/SPEC.docx
+++ b/SPEC.docx
@@ -3079,7 +3079,7 @@
     </w:p>
     <w:p>
       <w:r>
-        <w:t>For the class demo, NOCTURNE includes a personalized end-to-end AI flow on /personal-demo.html. The presenter uploads performer photos, describes his DJ style, and optionally uploads a short audio clip of one of his tracks. The frontend trims the clip to 30 seconds of mono 16 kHz WAV; an audio-input LLM (default google/gemini-2.5-flash via OpenRouter) listens to it and returns a structured style read (genre, BPM, energy, mood, venue signals). That read is concatenated with the typed style and fed to the LLM venue matcher, which returns ranked venues with reasoning. The presenter then triggers a Lyria 3 music clip and a Seedance 2.0 reference video for the chosen venue; the music prompt carries forward the structured audio analysis so the generated clip reflects the uploaded track's tempo, groove, energy, mood, and production cues while adapting them to the matched venue. Once both assets are ready, the app can mux the soundtrack into the MP4 via ffmpeg, falling back to browser-synced playback when ffmpeg is unavailable. The video call passes the venue's photograph as the input_reference (anchoring the model on the actual room). Performer photos are uploaded for UX continuity but are NOT currently forwarded to Seedance: hosted video-gen models (Seedance 2.0, Veo 3.1, Sora 2) reject input images of real people via content moderation ("InputImageSensitiveContentDetected.PrivacyInformation"), so the rendered clip places a generic stand-in DJ inside the matched venue. The personalized-identity beat is documented as a known limitation in §9.6. ElevenLabs voice remains a roadmap integration unless explicitly wired later.</w:t>
+        <w:t>For the class demo, NOCTURNE includes a personalized end-to-end AI flow on /personal-demo.html. The presenter uploads performer photos, describes his DJ style, and optionally uploads a short audio clip of one of his tracks. The frontend trims the clip to 30 seconds of mono 16 kHz WAV; an audio-input LLM (default google/gemini-2.5-flash via OpenRouter) listens to it and returns a structured style read (genre, BPM, energy, mood, venue signals). The uploaded photos are sent in parallel to a vision LLM (default google/gemini-2.5-flash) for a structured wardrobe read; the analyzer falls back to JSON-structural repair and regex extraction when the model returns malformed JSON, so a partial wardrobe still renders instead of "Photo analysis failed." Both reads are concatenated with the typed style and fed to the LLM venue matcher, which returns ranked venues with reasoning. The presenter then triggers a Lyria 3 song and a Seedance 2.0 reference video for the chosen venue. The music prompt carries forward the structured audio analysis so the generated clip reflects the uploaded track's tempo, groove, energy, mood, and production cues while adapting them to the matched venue, and it explicitly mirrors the source's vocal vs instrumental nature: when the upload contains vocals the new clip MUST add club-style vocal hooks/chants/ad-libs; when the upload is purely instrumental the new clip stays instrumental. Either way the prompt forbids copying specific melodies, lyrics, samples, or any singer's voice. The Lyria prompt is rendered into the music panel inside a collapsible &lt;details&gt; toggle so the long block stays hidden by default. Once both assets are ready, the app can mux the soundtrack into the MP4 via ffmpeg, falling back to browser-synced playback when ffmpeg is unavailable. The video call passes the venue's photograph as the input_reference (anchoring the model on the actual room). Performer photos are uploaded for UX continuity but are NOT currently forwarded to Seedance: hosted video-gen models (Seedance 2.0, Veo 3.1, Sora 2) reject input images of real people via content moderation ("InputImageSensitiveContentDetected.PrivacyInformation"), so the rendered clip places a generic stand-in DJ inside the matched venue. The personalized-identity beat is documented as a known limitation in §9.6. ElevenLabs voice remains a roadmap integration unless explicitly wired later.</w:t>
       </w:r>
     </w:p>
     <w:p>
@@ -3087,7 +3087,7 @@
         <w:spacing w:before="40" w:after="80"/>
       </w:pPr>
       <w:r>
-        <w:t>OpenRouter is live in v1, powering vibe matching, content generation, and Lyria 3 music previews (30-second instrumental clips tailored to the matched venue). The personalized video preview for the class demo also uses OpenRouter through an async video job. ElevenLabs voice remains scoped for v2/v3 roadmap work and is not presented as a production-live integration.</w:t>
+        <w:t>OpenRouter is live in v1, powering vibe matching, content generation, and Lyria 3 music previews (default google/lyria-3-pro-preview — a full-length, vocal-capable song tailored to the matched venue; the lighter google/lyria-3-clip-preview ∼30 s loop variant is still selectable via OPENROUTER_MUSIC_MODEL). The personalized video preview for the class demo also uses OpenRouter through an async video job. ElevenLabs voice remains scoped for v2/v3 roadmap work and is not presented as a production-live integration.</w:t>
       </w:r>
     </w:p>
     <w:tbl>
@@ -3240,7 +3240,7 @@
           </w:tcPr>
           <w:p>
             <w:r>
-              <w:t>30-second instrumental music clip tailored to the matched venue + performer style. When an uploaded track is available, the prompt uses the structured audio analysis as the musical fingerprint (tempo, groove, energy, mood, production notes, venue signals) while asking for a new instrumental rather than a copy. Routed through OpenRouter using the same single key as the LLM and video calls. Active model is google/lyria-3-clip-preview. The model is currently in preview and OpenRouter has been billing $0 per call as of 2026-04-29; published pricing is roughly $0.04 per 30-second clip when generally available.</w:t>
+              <w:t>Venue-tailored music clip generated per matched venue. When an uploaded track is available, the prompt uses the structured audio analysis as the musical fingerprint (tempo, groove, energy, mood, production notes, venue signals) and tells Lyria to mirror the source's vocal vs instrumental nature — vocal hooks/chants/ad-libs when the source has vocals, instrumental otherwise — without copying melodies, lyrics, samples, or any singer's voice. Routed through OpenRouter using the same single key as the LLM and video calls. Active model defaults to google/lyria-3-pro-preview (full-length song, vocal-capable, ∼$0.08 per generation as of 2026-05-07); the older google/lyria-3-clip-preview (∼30 s loop) remains selectable via OPENROUTER_MUSIC_MODEL and is still preview-priced at $0/call (published ∼$0.04 per clip when GA). Streaming + modalities:["text","audio"] required to receive audio (Lyria otherwise returns a text caption only).</w:t>
             </w:r>
           </w:p>
         </w:tc>

</xml_diff>